<commit_message>
Miscellaneous - uploading worksheet
</commit_message>
<xml_diff>
--- a/Worksheets/Surv_Worksheet2.docx
+++ b/Worksheets/Surv_Worksheet2.docx
@@ -764,52 +764,23 @@
     <w:p>
       <w:pPr>
         <w:spacing w:after="0"/>
-        <w:rPr>
-          <w:rFonts w:ascii="Arial" w:hAnsi="Arial" w:cs="Arial"/>
-          <w:sz w:val="24"/>
-          <w:szCs w:val="24"/>
-        </w:rPr>
-      </w:pPr>
-    </w:p>
-    <w:p>
-      <w:pPr>
-        <w:spacing w:after="0"/>
-        <w:rPr>
-          <w:rFonts w:ascii="Arial" w:hAnsi="Arial" w:cs="Arial"/>
-          <w:sz w:val="24"/>
-          <w:szCs w:val="24"/>
-        </w:rPr>
-      </w:pPr>
-    </w:p>
-    <w:p>
-      <w:pPr>
-        <w:spacing w:after="0"/>
-        <w:rPr>
-          <w:rFonts w:ascii="Arial" w:hAnsi="Arial" w:cs="Arial"/>
-          <w:sz w:val="24"/>
-          <w:szCs w:val="24"/>
-        </w:rPr>
-      </w:pPr>
-    </w:p>
-    <w:p>
-      <w:pPr>
-        <w:spacing w:after="0"/>
-        <w:rPr>
-          <w:rFonts w:ascii="Arial" w:hAnsi="Arial" w:cs="Arial"/>
-          <w:sz w:val="24"/>
-          <w:szCs w:val="24"/>
-        </w:rPr>
-      </w:pPr>
-    </w:p>
-    <w:p>
-      <w:pPr>
-        <w:spacing w:after="0"/>
-        <w:rPr>
-          <w:rFonts w:ascii="Arial" w:hAnsi="Arial" w:cs="Arial"/>
-          <w:sz w:val="24"/>
-          <w:szCs w:val="24"/>
-        </w:rPr>
-      </w:pPr>
+        <w:ind w:left="720"/>
+        <w:rPr>
+          <w:rFonts w:ascii="Arial" w:hAnsi="Arial" w:cs="Arial"/>
+          <w:color w:val="7030A0"/>
+          <w:sz w:val="24"/>
+          <w:szCs w:val="24"/>
+        </w:rPr>
+      </w:pPr>
+      <w:r>
+        <w:rPr>
+          <w:rFonts w:ascii="Arial" w:hAnsi="Arial" w:cs="Arial"/>
+          <w:color w:val="7030A0"/>
+          <w:sz w:val="24"/>
+          <w:szCs w:val="24"/>
+        </w:rPr>
+        <w:t>Could consider adding censoring summary information in the table.</w:t>
+      </w:r>
     </w:p>
     <w:p>
       <w:pPr>
@@ -838,10 +809,11 @@
           <w:sz w:val="24"/>
           <w:szCs w:val="24"/>
         </w:rPr>
+        <w:lastRenderedPageBreak/>
         <w:drawing>
-          <wp:inline distT="0" distB="0" distL="0" distR="0" wp14:anchorId="3D308F91" wp14:editId="6C8E4D5F">
-            <wp:extent cx="3721996" cy="1996782"/>
-            <wp:effectExtent l="0" t="0" r="0" b="0"/>
+          <wp:inline distT="0" distB="0" distL="0" distR="0" wp14:anchorId="3D308F91" wp14:editId="1F5AB7DC">
+            <wp:extent cx="3377193" cy="1811802"/>
+            <wp:effectExtent l="0" t="0" r="1270" b="4445"/>
             <wp:docPr id="1312159591" name="Picture 2"/>
             <wp:cNvGraphicFramePr>
               <a:graphicFrameLocks xmlns:a="http://schemas.openxmlformats.org/drawingml/2006/main" noChangeAspect="1"/>
@@ -862,7 +834,7 @@
                   <pic:spPr>
                     <a:xfrm>
                       <a:off x="0" y="0"/>
-                      <a:ext cx="3804781" cy="2041195"/>
+                      <a:ext cx="3460405" cy="1856444"/>
                     </a:xfrm>
                     <a:prstGeom prst="rect">
                       <a:avLst/>
@@ -954,9 +926,9 @@
           <w:szCs w:val="24"/>
         </w:rPr>
         <w:drawing>
-          <wp:inline distT="0" distB="0" distL="0" distR="0" wp14:anchorId="7D34E1A9" wp14:editId="42AA8556">
-            <wp:extent cx="3244361" cy="2051799"/>
-            <wp:effectExtent l="0" t="0" r="0" b="5715"/>
+          <wp:inline distT="0" distB="0" distL="0" distR="0" wp14:anchorId="7D34E1A9" wp14:editId="7A88CA3D">
+            <wp:extent cx="2549770" cy="1612526"/>
+            <wp:effectExtent l="0" t="0" r="3175" b="635"/>
             <wp:docPr id="1490192071" name="Picture 5"/>
             <wp:cNvGraphicFramePr>
               <a:graphicFrameLocks xmlns:a="http://schemas.openxmlformats.org/drawingml/2006/main" noChangeAspect="1"/>
@@ -977,7 +949,7 @@
                   <pic:spPr>
                     <a:xfrm>
                       <a:off x="0" y="0"/>
-                      <a:ext cx="3287488" cy="2079074"/>
+                      <a:ext cx="2600787" cy="1644790"/>
                     </a:xfrm>
                     <a:prstGeom prst="rect">
                       <a:avLst/>
@@ -1035,6 +1007,15 @@
         </w:rPr>
         <w:t>death is 44.92% lower for treatment group 2 compared to treatment group 1.</w:t>
       </w:r>
+      <w:r>
+        <w:rPr>
+          <w:rFonts w:ascii="Arial" w:hAnsi="Arial" w:cs="Arial"/>
+          <w:color w:val="7030A0"/>
+          <w:sz w:val="24"/>
+          <w:szCs w:val="24"/>
+        </w:rPr>
+        <w:t xml:space="preserve"> This difference was not statistically significant (p = 0.3). </w:t>
+      </w:r>
     </w:p>
     <w:p>
       <w:pPr>
@@ -1086,11 +1067,10 @@
           <w:sz w:val="24"/>
           <w:szCs w:val="24"/>
         </w:rPr>
-        <w:lastRenderedPageBreak/>
         <w:drawing>
-          <wp:inline distT="0" distB="0" distL="0" distR="0" wp14:anchorId="62ED49AF" wp14:editId="4430A48D">
-            <wp:extent cx="3659554" cy="3062809"/>
-            <wp:effectExtent l="0" t="0" r="0" b="0"/>
+          <wp:inline distT="0" distB="0" distL="0" distR="0" wp14:anchorId="62ED49AF" wp14:editId="7D8BFB12">
+            <wp:extent cx="2545741" cy="2130620"/>
+            <wp:effectExtent l="0" t="0" r="0" b="3175"/>
             <wp:docPr id="1073620120" name="Picture 4"/>
             <wp:cNvGraphicFramePr>
               <a:graphicFrameLocks xmlns:a="http://schemas.openxmlformats.org/drawingml/2006/main" noChangeAspect="1"/>
@@ -1111,7 +1091,7 @@
                   <pic:spPr>
                     <a:xfrm>
                       <a:off x="0" y="0"/>
-                      <a:ext cx="3689766" cy="3088095"/>
+                      <a:ext cx="2576579" cy="2156429"/>
                     </a:xfrm>
                     <a:prstGeom prst="rect">
                       <a:avLst/>
@@ -1237,6 +1217,7 @@
           <w:sz w:val="24"/>
           <w:szCs w:val="24"/>
         </w:rPr>
+        <w:lastRenderedPageBreak/>
         <w:t>Descriptive statistics will be computed for all baseline characteristics, presented in a Table 1</w:t>
       </w:r>
     </w:p>
@@ -3683,6 +3664,7 @@
     <w:rsid w:val="002D113A"/>
     <w:rsid w:val="00415CCC"/>
     <w:rsid w:val="004279B6"/>
+    <w:rsid w:val="005A7096"/>
     <w:rsid w:val="00623041"/>
     <w:rsid w:val="006277D5"/>
     <w:rsid w:val="0079290A"/>
@@ -3692,6 +3674,7 @@
     <w:rsid w:val="009C3683"/>
     <w:rsid w:val="00AA65C1"/>
     <w:rsid w:val="00B8665A"/>
+    <w:rsid w:val="00E3794D"/>
     <w:rsid w:val="00E96807"/>
   </w:rsids>
   <m:mathPr>

</xml_diff>